<commit_message>
Update project title and core mechanics to reflect new design direction
- Changed project title from "One Last Bullet" to "Tavern Roguelike" across all documentation and files, aligning with the updated game concept.
- Revised gameplay mechanics to feature a wizard character using an "orb of chaos" instead of a sheriff with a bullet, enhancing the thematic focus on magic and survival.
- Updated DECISIONS.md, GAME_BRIEF.md, and other design documents to reflect changes in gameplay dynamics, including the introduction of mana as a collectible resource and the removal of the western theme.
- Adjusted player and enemy interactions to accommodate the new orb mechanics, ensuring a cohesive gameplay experience.
- Enhanced project organization in PROJECT_MAP.md to reflect the new title and design elements.
</commit_message>
<xml_diff>
--- a/planning/One Last Bullet.docx
+++ b/planning/One Last Bullet.docx
@@ -47,14 +47,116 @@
         <w:rPr>
           <w:lang w:val="en-US"/>
         </w:rPr>
-        <w:t>You are a Sherrif in a old western saloon filled with enemies. You have one bullet left in your gun. Game starts with you firing that bullet, which will bounce around the room damaging any enemies it hits but also killing you instantly if you hit it.</w:t>
+        <w:t xml:space="preserve">You are a </w:t>
+      </w:r>
+      <w:r>
+        <w:rPr>
+          <w:lang w:val="en-US"/>
+        </w:rPr>
+        <w:t>wizard stuck in a room with enemies</w:t>
+      </w:r>
+      <w:r>
+        <w:rPr>
+          <w:lang w:val="en-US"/>
+        </w:rPr>
+        <w:t xml:space="preserve">. You have </w:t>
+      </w:r>
+      <w:r>
+        <w:rPr>
+          <w:lang w:val="en-US"/>
+        </w:rPr>
+        <w:t xml:space="preserve">only </w:t>
+      </w:r>
+      <w:r>
+        <w:rPr>
+          <w:lang w:val="en-US"/>
+        </w:rPr>
+        <w:t xml:space="preserve">one </w:t>
+      </w:r>
+      <w:r>
+        <w:rPr>
+          <w:lang w:val="en-US"/>
+        </w:rPr>
+        <w:t>spell left to shoot: the orb of chaos</w:t>
+      </w:r>
+      <w:r>
+        <w:rPr>
+          <w:lang w:val="en-US"/>
+        </w:rPr>
+        <w:t xml:space="preserve">. Game starts with you firing that </w:t>
+      </w:r>
+      <w:r>
+        <w:rPr>
+          <w:lang w:val="en-US"/>
+        </w:rPr>
+        <w:t>orb</w:t>
+      </w:r>
+      <w:r>
+        <w:rPr>
+          <w:lang w:val="en-US"/>
+        </w:rPr>
+        <w:t>, which will bounce around the</w:t>
+      </w:r>
+      <w:r>
+        <w:rPr>
+          <w:lang w:val="en-US"/>
+        </w:rPr>
+        <w:t xml:space="preserve"> stage</w:t>
+      </w:r>
+      <w:r>
+        <w:rPr>
+          <w:lang w:val="en-US"/>
+        </w:rPr>
+        <w:t xml:space="preserve"> damaging any enemies it hits but also </w:t>
+      </w:r>
+      <w:r>
+        <w:rPr>
+          <w:lang w:val="en-US"/>
+        </w:rPr>
+        <w:t>damaging</w:t>
+      </w:r>
+      <w:r>
+        <w:rPr>
+          <w:lang w:val="en-US"/>
+        </w:rPr>
+        <w:t xml:space="preserve"> you</w:t>
+      </w:r>
+      <w:r>
+        <w:rPr>
+          <w:lang w:val="en-US"/>
+        </w:rPr>
+        <w:t xml:space="preserve"> </w:t>
+      </w:r>
+      <w:r>
+        <w:rPr>
+          <w:lang w:val="en-US"/>
+        </w:rPr>
+        <w:t>if you hit it.</w:t>
       </w:r>
       <w:r>
         <w:rPr>
           <w:lang w:val="en-US"/>
         </w:rPr>
         <w:br/>
-        <w:t>To help you kill your enemies you can re-direct the bullet by being close to it and pressing a button. Times then briefly slows down and you can choose a direction for the bullet to go.</w:t>
+        <w:t xml:space="preserve">To help you kill your enemies you can re-direct the bullet by being close to it and pressing a button. </w:t>
+      </w:r>
+      <w:r>
+        <w:rPr>
+          <w:lang w:val="en-US"/>
+        </w:rPr>
+        <w:t>The orb then travels around you and you can release it</w:t>
+      </w:r>
+      <w:r>
+        <w:rPr>
+          <w:lang w:val="en-US"/>
+        </w:rPr>
+        <w:t xml:space="preserve"> </w:t>
+      </w:r>
+      <w:r>
+        <w:rPr>
+          <w:lang w:val="en-US"/>
+        </w:rPr>
+        <w:t>in order to aim it where you want it to go.</w:t>
       </w:r>
       <w:r>
         <w:rPr>
@@ -67,7 +169,25 @@
           <w:lang w:val="en-US"/>
         </w:rPr>
         <w:br/>
-        <w:t>Enemies drop gold which needs to be picked up quickly.</w:t>
+        <w:t xml:space="preserve">Enemies drop </w:t>
+      </w:r>
+      <w:r>
+        <w:rPr>
+          <w:lang w:val="en-US"/>
+        </w:rPr>
+        <w:t>mana</w:t>
+      </w:r>
+      <w:r>
+        <w:rPr>
+          <w:lang w:val="en-US"/>
+        </w:rPr>
+        <w:t xml:space="preserve"> which needs to be picked up quickly</w:t>
+      </w:r>
+      <w:r>
+        <w:rPr>
+          <w:lang w:val="en-US"/>
+        </w:rPr>
+        <w:t xml:space="preserve"> and can later be used to upgrade the orb</w:t>
       </w:r>
     </w:p>
     <w:p>
@@ -101,13 +221,7 @@
         <w:rPr>
           <w:lang w:val="en-US"/>
         </w:rPr>
-        <w:t xml:space="preserve">You win the level when all enemies are </w:t>
-      </w:r>
-      <w:r>
-        <w:rPr>
-          <w:lang w:val="en-US"/>
-        </w:rPr>
-        <w:t>dead. You lose if you die. You can die from enemies or getting hit by the bullet.</w:t>
+        <w:t>You win the level when all enemies are dead. You lose if you die. You can die from enemies or getting hit by the bullet.</w:t>
       </w:r>
       <w:r>
         <w:rPr>
@@ -146,7 +260,37 @@
         <w:rPr>
           <w:lang w:val="en-US"/>
         </w:rPr>
-        <w:t>Very lean. You are a Sherriff defending your towns saloon from enemies. Doesent have to be more complicated then that. The game is more of a gameplay focused arcade game.</w:t>
+        <w:t xml:space="preserve">Very lean. You are a </w:t>
+      </w:r>
+      <w:r>
+        <w:rPr>
+          <w:lang w:val="en-US"/>
+        </w:rPr>
+        <w:t xml:space="preserve">wizard </w:t>
+      </w:r>
+      <w:r>
+        <w:rPr>
+          <w:lang w:val="en-US"/>
+        </w:rPr>
+        <w:t xml:space="preserve">defending </w:t>
+      </w:r>
+      <w:r>
+        <w:rPr>
+          <w:lang w:val="en-US"/>
+        </w:rPr>
+        <w:t>yourself from various nefarious beings</w:t>
+      </w:r>
+      <w:r>
+        <w:rPr>
+          <w:lang w:val="en-US"/>
+        </w:rPr>
+        <w:t>. Doesent have to be more complicated then that. The game is more of a gameplay focused arcade game.</w:t>
+      </w:r>
+      <w:r>
+        <w:rPr>
+          <w:lang w:val="en-US"/>
+        </w:rPr>
+        <w:t xml:space="preserve"> </w:t>
       </w:r>
       <w:r>
         <w:rPr>
@@ -172,7 +316,13 @@
         <w:rPr>
           <w:lang w:val="en-US"/>
         </w:rPr>
-        <w:t>The bullet</w:t>
+        <w:t xml:space="preserve">The </w:t>
+      </w:r>
+      <w:r>
+        <w:rPr>
+          <w:lang w:val="en-US"/>
+        </w:rPr>
+        <w:t>orb</w:t>
       </w:r>
     </w:p>
     <w:p>
@@ -185,7 +335,25 @@
         <w:rPr>
           <w:lang w:val="en-SE"/>
         </w:rPr>
-        <w:t xml:space="preserve">Shot by the player at the beginning of the game in any direction from where they are standing (center bottom screen). Then the bullet will travel and bounce around freely forever. The speed should be slow enough that the player can interact with the bullet but fast enough that avoiding it should be a challenge. </w:t>
+        <w:t xml:space="preserve">Shot by the player at the beginning of the game in any direction from where they are standing (center bottom screen). Then the </w:t>
+      </w:r>
+      <w:r>
+        <w:rPr>
+          <w:lang w:val="en-SE"/>
+        </w:rPr>
+        <w:t xml:space="preserve">orb </w:t>
+      </w:r>
+      <w:r>
+        <w:rPr>
+          <w:lang w:val="en-SE"/>
+        </w:rPr>
+        <w:t xml:space="preserve">will travel and bounce around freely forever. The speed should be slow enough that the player can interact with the bullet but fast enough that avoiding it should be a challenge. </w:t>
+      </w:r>
+      <w:r>
+        <w:rPr>
+          <w:lang w:val="en-SE"/>
+        </w:rPr>
+        <w:t>The orbs speed and damage increases each time you redirect it</w:t>
       </w:r>
       <w:r>
         <w:rPr>
@@ -224,7 +392,13 @@
         <w:rPr>
           <w:lang w:val="en-SE"/>
         </w:rPr>
-        <w:t>Every stage takes place in a saloon with randomized enemies</w:t>
+        <w:t xml:space="preserve">There will be different stages and environment, with </w:t>
+      </w:r>
+      <w:r>
+        <w:rPr>
+          <w:lang w:val="en-SE"/>
+        </w:rPr>
+        <w:t>randomized enemies</w:t>
       </w:r>
       <w:r>
         <w:rPr>
@@ -242,7 +416,19 @@
         <w:rPr>
           <w:lang w:val="en-SE"/>
         </w:rPr>
-        <w:t>. Various obstacles interact with the bullet and the environment. For example, a barrel of TNT can explode.</w:t>
+        <w:t xml:space="preserve">. Various obstacles interact with the </w:t>
+      </w:r>
+      <w:r>
+        <w:rPr>
+          <w:lang w:val="en-SE"/>
+        </w:rPr>
+        <w:t>orb</w:t>
+      </w:r>
+      <w:r>
+        <w:rPr>
+          <w:lang w:val="en-SE"/>
+        </w:rPr>
+        <w:t xml:space="preserve"> and the environment. For example, a barrel of TNT can explode.</w:t>
       </w:r>
       <w:r>
         <w:rPr>
@@ -256,7 +442,31 @@
           <w:lang w:val="en-SE"/>
         </w:rPr>
         <w:br/>
-        <w:t>Enemies will also drop coins which the player can pickup. But the gold disappears after a while so you need to be fast.</w:t>
+        <w:t xml:space="preserve">Enemies will also drop </w:t>
+      </w:r>
+      <w:r>
+        <w:rPr>
+          <w:lang w:val="en-SE"/>
+        </w:rPr>
+        <w:t>mana</w:t>
+      </w:r>
+      <w:r>
+        <w:rPr>
+          <w:lang w:val="en-SE"/>
+        </w:rPr>
+        <w:t xml:space="preserve"> which the player can pickup. But the </w:t>
+      </w:r>
+      <w:r>
+        <w:rPr>
+          <w:lang w:val="en-SE"/>
+        </w:rPr>
+        <w:t>mana</w:t>
+      </w:r>
+      <w:r>
+        <w:rPr>
+          <w:lang w:val="en-SE"/>
+        </w:rPr>
+        <w:t xml:space="preserve"> disappears after a while so you need to be fast.</w:t>
       </w:r>
     </w:p>
     <w:p>
@@ -291,7 +501,43 @@
         <w:rPr>
           <w:lang w:val="en-US"/>
         </w:rPr>
-        <w:t>After each level the player enters a shop where they can spend gold on various randomized upgrades. It can be things that improve the bullet, or the player, or curses the enemies somehow. Much of the fun should be in finding interesting synergies.</w:t>
+        <w:t xml:space="preserve">After each level the player enters a </w:t>
+      </w:r>
+      <w:r>
+        <w:rPr>
+          <w:lang w:val="en-US"/>
+        </w:rPr>
+        <w:t>“</w:t>
+      </w:r>
+      <w:r>
+        <w:rPr>
+          <w:lang w:val="en-US"/>
+        </w:rPr>
+        <w:t>shop</w:t>
+      </w:r>
+      <w:r>
+        <w:rPr>
+          <w:lang w:val="en-US"/>
+        </w:rPr>
+        <w:t>”</w:t>
+      </w:r>
+      <w:r>
+        <w:rPr>
+          <w:lang w:val="en-US"/>
+        </w:rPr>
+        <w:t xml:space="preserve"> where they can spend</w:t>
+      </w:r>
+      <w:r>
+        <w:rPr>
+          <w:lang w:val="en-US"/>
+        </w:rPr>
+        <w:t xml:space="preserve"> mana</w:t>
+      </w:r>
+      <w:r>
+        <w:rPr>
+          <w:lang w:val="en-US"/>
+        </w:rPr>
+        <w:t xml:space="preserve"> on various randomized upgrades. It can be things that improve the bullet, or the player, or curses the enemies somehow. Much of the fun should be in finding interesting synergies.</w:t>
       </w:r>
       <w:r>
         <w:rPr>
@@ -331,7 +577,31 @@
         <w:rPr>
           <w:lang w:val="en-US"/>
         </w:rPr>
-        <w:t>For now only one basic enemy that chases the player and kills him on contact.</w:t>
+        <w:t xml:space="preserve">For now only </w:t>
+      </w:r>
+      <w:r>
+        <w:rPr>
+          <w:lang w:val="en-US"/>
+        </w:rPr>
+        <w:t xml:space="preserve">two </w:t>
+      </w:r>
+      <w:r>
+        <w:rPr>
+          <w:lang w:val="en-US"/>
+        </w:rPr>
+        <w:t xml:space="preserve">basic enemy that chases the player and </w:t>
+      </w:r>
+      <w:r>
+        <w:rPr>
+          <w:lang w:val="en-US"/>
+        </w:rPr>
+        <w:t xml:space="preserve">damage him </w:t>
+      </w:r>
+      <w:r>
+        <w:rPr>
+          <w:lang w:val="en-US"/>
+        </w:rPr>
+        <w:t>on contact.</w:t>
       </w:r>
     </w:p>
     <w:sectPr>

</xml_diff>